<commit_message>
Refine report layout and recommender workflow
</commit_message>
<xml_diff>
--- a/reports/Studor_PathAI_Report.docx
+++ b/reports/Studor_PathAI_Report.docx
@@ -35,7 +35,7 @@
     </w:p>
     <w:p>
       <w:r>
-        <w:t>The dataset contains 32,593 enrolments across 7 modules. Overall risk rate is 52.8%. The Week 6 urgent tier alerts 57.7% of the test cohort at recall 83.3% and precision 76.2% (ROC-AUC 0.872). The engagement score band gradient runs from 98.4% withdraw/fail (0–20 band) to 19.0% (80–100 band). Collaborative filtering hit@3 is 59.4% versus 11.1% for content-based recommendations.</w:t>
+        <w:t>The dataset contains 32,593 enrolments across 7 modules. Overall risk rate is 52.8%. The Week 6 model now feeds three intervention tiers instead of a broad urgent alert: top 20.1% high-touch support queue, next 40.1% light-touch nudges, and monitoring for the rest (ROC-AUC 0.870). The engagement score band gradient runs from 98.4% withdraw/fail (0–20 band) to 19.0% (80–100 band). Collaborative filtering hit@3 is 46.8% versus 35.4% for content-based recommendations.</w:t>
       </w:r>
     </w:p>
     <w:p>
@@ -2721,9 +2721,383 @@
     </w:p>
     <w:p>
       <w:r>
-        <w:t>The notebook compares Logistic Regression, Random Forest, KNN, calibrated Linear SVC, XGBoost, a regularized XGBoost variant, and Soft Voting. The urgent-alert classifier is chosen by cross-validated F1, with PR-AUC and ROC-AUC used as secondary checks. A broader watchlist keeps a separate higher-recall F2 threshold.</w:t>
+        <w:t>The notebook model-selection table compared Logistic Regression, Random Forest, XGBoost, and a regularized XGBoost variant. XGBoost is now the production model because it delivered the best validation F1 and recall while keeping ROC-AUC and PR-AUC competitive. To reduce runtime, default pipeline runs now train XGBoost only and retain the comparison table as model-selection evidence.</w:t>
       </w:r>
     </w:p>
+    <w:tbl>
+      <w:tblPr>
+        <w:tblStyle w:val="LightGrid-Accent1"/>
+        <w:tblW w:type="auto" w:w="0"/>
+        <w:tblLook w:firstColumn="1" w:firstRow="1" w:lastColumn="0" w:lastRow="0" w:noHBand="0" w:noVBand="1" w:val="04A0"/>
+      </w:tblPr>
+      <w:tblGrid>
+        <w:gridCol w:w="1440"/>
+        <w:gridCol w:w="1440"/>
+        <w:gridCol w:w="1440"/>
+        <w:gridCol w:w="1440"/>
+        <w:gridCol w:w="1440"/>
+        <w:gridCol w:w="1440"/>
+      </w:tblGrid>
+      <w:tr>
+        <w:tc>
+          <w:tcPr>
+            <w:tcW w:type="dxa" w:w="1440"/>
+          </w:tcPr>
+          <w:p>
+            <w:r>
+              <w:t>Model</w:t>
+            </w:r>
+          </w:p>
+        </w:tc>
+        <w:tc>
+          <w:tcPr>
+            <w:tcW w:type="dxa" w:w="1440"/>
+          </w:tcPr>
+          <w:p>
+            <w:r>
+              <w:t>Precision</w:t>
+            </w:r>
+          </w:p>
+        </w:tc>
+        <w:tc>
+          <w:tcPr>
+            <w:tcW w:type="dxa" w:w="1440"/>
+          </w:tcPr>
+          <w:p>
+            <w:r>
+              <w:t>Recall</w:t>
+            </w:r>
+          </w:p>
+        </w:tc>
+        <w:tc>
+          <w:tcPr>
+            <w:tcW w:type="dxa" w:w="1440"/>
+          </w:tcPr>
+          <w:p>
+            <w:r>
+              <w:t>F1</w:t>
+            </w:r>
+          </w:p>
+        </w:tc>
+        <w:tc>
+          <w:tcPr>
+            <w:tcW w:type="dxa" w:w="1440"/>
+          </w:tcPr>
+          <w:p>
+            <w:r>
+              <w:t>ROC-AUC</w:t>
+            </w:r>
+          </w:p>
+        </w:tc>
+        <w:tc>
+          <w:tcPr>
+            <w:tcW w:type="dxa" w:w="1440"/>
+          </w:tcPr>
+          <w:p>
+            <w:r>
+              <w:t>Decision</w:t>
+            </w:r>
+          </w:p>
+        </w:tc>
+      </w:tr>
+      <w:tr>
+        <w:tc>
+          <w:tcPr>
+            <w:tcW w:type="dxa" w:w="1440"/>
+          </w:tcPr>
+          <w:p>
+            <w:r>
+              <w:t>xgboost</w:t>
+            </w:r>
+          </w:p>
+        </w:tc>
+        <w:tc>
+          <w:tcPr>
+            <w:tcW w:type="dxa" w:w="1440"/>
+          </w:tcPr>
+          <w:p>
+            <w:r>
+              <w:t>0.738</w:t>
+            </w:r>
+          </w:p>
+        </w:tc>
+        <w:tc>
+          <w:tcPr>
+            <w:tcW w:type="dxa" w:w="1440"/>
+          </w:tcPr>
+          <w:p>
+            <w:r>
+              <w:t>0.842</w:t>
+            </w:r>
+          </w:p>
+        </w:tc>
+        <w:tc>
+          <w:tcPr>
+            <w:tcW w:type="dxa" w:w="1440"/>
+          </w:tcPr>
+          <w:p>
+            <w:r>
+              <w:t>0.787</w:t>
+            </w:r>
+          </w:p>
+        </w:tc>
+        <w:tc>
+          <w:tcPr>
+            <w:tcW w:type="dxa" w:w="1440"/>
+          </w:tcPr>
+          <w:p>
+            <w:r>
+              <w:t>0.863</w:t>
+            </w:r>
+          </w:p>
+        </w:tc>
+        <w:tc>
+          <w:tcPr>
+            <w:tcW w:type="dxa" w:w="1440"/>
+          </w:tcPr>
+          <w:p>
+            <w:r>
+              <w:t>selected_production_model</w:t>
+            </w:r>
+          </w:p>
+        </w:tc>
+      </w:tr>
+      <w:tr>
+        <w:tc>
+          <w:tcPr>
+            <w:tcW w:type="dxa" w:w="1440"/>
+          </w:tcPr>
+          <w:p>
+            <w:r>
+              <w:t>xgboost_regularized</w:t>
+            </w:r>
+          </w:p>
+        </w:tc>
+        <w:tc>
+          <w:tcPr>
+            <w:tcW w:type="dxa" w:w="1440"/>
+          </w:tcPr>
+          <w:p>
+            <w:r>
+              <w:t>0.753</w:t>
+            </w:r>
+          </w:p>
+        </w:tc>
+        <w:tc>
+          <w:tcPr>
+            <w:tcW w:type="dxa" w:w="1440"/>
+          </w:tcPr>
+          <w:p>
+            <w:r>
+              <w:t>0.817</w:t>
+            </w:r>
+          </w:p>
+        </w:tc>
+        <w:tc>
+          <w:tcPr>
+            <w:tcW w:type="dxa" w:w="1440"/>
+          </w:tcPr>
+          <w:p>
+            <w:r>
+              <w:t>0.784</w:t>
+            </w:r>
+          </w:p>
+        </w:tc>
+        <w:tc>
+          <w:tcPr>
+            <w:tcW w:type="dxa" w:w="1440"/>
+          </w:tcPr>
+          <w:p>
+            <w:r>
+              <w:t>0.858</w:t>
+            </w:r>
+          </w:p>
+        </w:tc>
+        <w:tc>
+          <w:tcPr>
+            <w:tcW w:type="dxa" w:w="1440"/>
+          </w:tcPr>
+          <w:p>
+            <w:r>
+              <w:t>close_second_lower_recall</w:t>
+            </w:r>
+          </w:p>
+        </w:tc>
+      </w:tr>
+      <w:tr>
+        <w:tc>
+          <w:tcPr>
+            <w:tcW w:type="dxa" w:w="1440"/>
+          </w:tcPr>
+          <w:p>
+            <w:r>
+              <w:t>random_forest</w:t>
+            </w:r>
+          </w:p>
+        </w:tc>
+        <w:tc>
+          <w:tcPr>
+            <w:tcW w:type="dxa" w:w="1440"/>
+          </w:tcPr>
+          <w:p>
+            <w:r>
+              <w:t>0.754</w:t>
+            </w:r>
+          </w:p>
+        </w:tc>
+        <w:tc>
+          <w:tcPr>
+            <w:tcW w:type="dxa" w:w="1440"/>
+          </w:tcPr>
+          <w:p>
+            <w:r>
+              <w:t>0.816</w:t>
+            </w:r>
+          </w:p>
+        </w:tc>
+        <w:tc>
+          <w:tcPr>
+            <w:tcW w:type="dxa" w:w="1440"/>
+          </w:tcPr>
+          <w:p>
+            <w:r>
+              <w:t>0.783</w:t>
+            </w:r>
+          </w:p>
+        </w:tc>
+        <w:tc>
+          <w:tcPr>
+            <w:tcW w:type="dxa" w:w="1440"/>
+          </w:tcPr>
+          <w:p>
+            <w:r>
+              <w:t>0.857</w:t>
+            </w:r>
+          </w:p>
+        </w:tc>
+        <w:tc>
+          <w:tcPr>
+            <w:tcW w:type="dxa" w:w="1440"/>
+          </w:tcPr>
+          <w:p>
+            <w:r>
+              <w:t>close_second_lower_recall</w:t>
+            </w:r>
+          </w:p>
+        </w:tc>
+      </w:tr>
+      <w:tr>
+        <w:tc>
+          <w:tcPr>
+            <w:tcW w:type="dxa" w:w="1440"/>
+          </w:tcPr>
+          <w:p>
+            <w:r>
+              <w:t>logistic_regression</w:t>
+            </w:r>
+          </w:p>
+        </w:tc>
+        <w:tc>
+          <w:tcPr>
+            <w:tcW w:type="dxa" w:w="1440"/>
+          </w:tcPr>
+          <w:p>
+            <w:r>
+              <w:t>0.773</w:t>
+            </w:r>
+          </w:p>
+        </w:tc>
+        <w:tc>
+          <w:tcPr>
+            <w:tcW w:type="dxa" w:w="1440"/>
+          </w:tcPr>
+          <w:p>
+            <w:r>
+              <w:t>0.794</w:t>
+            </w:r>
+          </w:p>
+        </w:tc>
+        <w:tc>
+          <w:tcPr>
+            <w:tcW w:type="dxa" w:w="1440"/>
+          </w:tcPr>
+          <w:p>
+            <w:r>
+              <w:t>0.783</w:t>
+            </w:r>
+          </w:p>
+        </w:tc>
+        <w:tc>
+          <w:tcPr>
+            <w:tcW w:type="dxa" w:w="1440"/>
+          </w:tcPr>
+          <w:p>
+            <w:r>
+              <w:t>0.859</w:t>
+            </w:r>
+          </w:p>
+        </w:tc>
+        <w:tc>
+          <w:tcPr>
+            <w:tcW w:type="dxa" w:w="1440"/>
+          </w:tcPr>
+          <w:p>
+            <w:r>
+              <w:t>strong_baseline_lower_recall</w:t>
+            </w:r>
+          </w:p>
+        </w:tc>
+      </w:tr>
+    </w:tbl>
+    <w:p/>
+    <w:p>
+      <w:r>
+        <w:drawing>
+          <wp:inline xmlns:a="http://schemas.openxmlformats.org/drawingml/2006/main" xmlns:pic="http://schemas.openxmlformats.org/drawingml/2006/picture">
+            <wp:extent cx="5852160" cy="4389120"/>
+            <wp:docPr id="7" name="Picture 7"/>
+            <wp:cNvGraphicFramePr>
+              <a:graphicFrameLocks noChangeAspect="1"/>
+            </wp:cNvGraphicFramePr>
+            <a:graphic>
+              <a:graphicData uri="http://schemas.openxmlformats.org/drawingml/2006/picture">
+                <pic:pic>
+                  <pic:nvPicPr>
+                    <pic:cNvPr id="0" name="task2_behavioral_correlation_heatmap.png"/>
+                    <pic:cNvPicPr/>
+                  </pic:nvPicPr>
+                  <pic:blipFill>
+                    <a:blip r:embed="rId15"/>
+                    <a:stretch>
+                      <a:fillRect/>
+                    </a:stretch>
+                  </pic:blipFill>
+                  <pic:spPr>
+                    <a:xfrm>
+                      <a:off x="0" y="0"/>
+                      <a:ext cx="5852160" cy="4389120"/>
+                    </a:xfrm>
+                    <a:prstGeom prst="rect"/>
+                  </pic:spPr>
+                </pic:pic>
+              </a:graphicData>
+            </a:graphic>
+          </wp:inline>
+        </w:drawing>
+      </w:r>
+    </w:p>
+    <w:p>
+      <w:pPr>
+        <w:jc w:val="center"/>
+      </w:pPr>
+      <w:r>
+        <w:rPr>
+          <w:i/>
+        </w:rPr>
+        <w:t>Figure 6. Task 2 Week 6 behavioural feature correlation heatmap.</w:t>
+      </w:r>
+    </w:p>
+    <w:p/>
     <w:p>
       <w:r>
         <w:t>Task 2 now carries forward the Task 1 engagement framework directly: the model includes engagement_score_6, a Week 6-safe behavioural archetype, train-only archetype/profile risk priors, ordered education and age features, IMD midpoint, module-normalized credit load, resource-mix ratios, and selected interaction terms.</w:t>
@@ -2812,7 +3186,7 @@
           </w:tcPr>
           <w:p>
             <w:r>
-              <w:t>urgent_balanced_f1</w:t>
+              <w:t>high_touch_20pct</w:t>
             </w:r>
           </w:p>
         </w:tc>
@@ -2822,7 +3196,7 @@
           </w:tcPr>
           <w:p>
             <w:r>
-              <w:t>0.384</w:t>
+              <w:t>0.928</w:t>
             </w:r>
           </w:p>
         </w:tc>
@@ -2832,7 +3206,7 @@
           </w:tcPr>
           <w:p>
             <w:r>
-              <w:t>0.762</w:t>
+              <w:t>0.991</w:t>
             </w:r>
           </w:p>
         </w:tc>
@@ -2842,7 +3216,7 @@
           </w:tcPr>
           <w:p>
             <w:r>
-              <w:t>0.833</w:t>
+              <w:t>0.377</w:t>
             </w:r>
           </w:p>
         </w:tc>
@@ -2852,7 +3226,7 @@
           </w:tcPr>
           <w:p>
             <w:r>
-              <w:t>717</w:t>
+              <w:t>2681</w:t>
             </w:r>
           </w:p>
         </w:tc>
@@ -2862,7 +3236,7 @@
           </w:tcPr>
           <w:p>
             <w:r>
-              <w:t>1119</w:t>
+              <w:t>14</w:t>
             </w:r>
           </w:p>
         </w:tc>
@@ -2874,7 +3248,7 @@
           </w:tcPr>
           <w:p>
             <w:r>
-              <w:t>watchlist_f2</w:t>
+              <w:t>light_touch_60pct</w:t>
             </w:r>
           </w:p>
         </w:tc>
@@ -2884,7 +3258,7 @@
           </w:tcPr>
           <w:p>
             <w:r>
-              <w:t>0.188</w:t>
+              <w:t>0.372</w:t>
             </w:r>
           </w:p>
         </w:tc>
@@ -2894,7 +3268,7 @@
           </w:tcPr>
           <w:p>
             <w:r>
-              <w:t>0.603</w:t>
+              <w:t>0.744</w:t>
             </w:r>
           </w:p>
         </w:tc>
@@ -2904,7 +3278,7 @@
           </w:tcPr>
           <w:p>
             <w:r>
-              <w:t>0.970</w:t>
+              <w:t>0.848</w:t>
             </w:r>
           </w:p>
         </w:tc>
@@ -2914,7 +3288,7 @@
           </w:tcPr>
           <w:p>
             <w:r>
-              <w:t>128</w:t>
+              <w:t>654</w:t>
             </w:r>
           </w:p>
         </w:tc>
@@ -2924,7 +3298,7 @@
           </w:tcPr>
           <w:p>
             <w:r>
-              <w:t>2750</w:t>
+              <w:t>1256</w:t>
             </w:r>
           </w:p>
         </w:tc>
@@ -2936,7 +3310,7 @@
           </w:tcPr>
           <w:p>
             <w:r>
-              <w:t>urgent_recall85</w:t>
+              <w:t>cv_max_f1_threshold</w:t>
             </w:r>
           </w:p>
         </w:tc>
@@ -2946,7 +3320,7 @@
           </w:tcPr>
           <w:p>
             <w:r>
-              <w:t>0.352</w:t>
+              <w:t>0.370</w:t>
             </w:r>
           </w:p>
         </w:tc>
@@ -2956,7 +3330,7 @@
           </w:tcPr>
           <w:p>
             <w:r>
-              <w:t>0.735</w:t>
+              <w:t>0.742</w:t>
             </w:r>
           </w:p>
         </w:tc>
@@ -2966,7 +3340,7 @@
           </w:tcPr>
           <w:p>
             <w:r>
-              <w:t>0.859</w:t>
+              <w:t>0.849</w:t>
             </w:r>
           </w:p>
         </w:tc>
@@ -2976,7 +3350,7 @@
           </w:tcPr>
           <w:p>
             <w:r>
-              <w:t>605</w:t>
+              <w:t>651</w:t>
             </w:r>
           </w:p>
         </w:tc>
@@ -2986,7 +3360,7 @@
           </w:tcPr>
           <w:p>
             <w:r>
-              <w:t>1330</w:t>
+              <w:t>1269</w:t>
             </w:r>
           </w:p>
         </w:tc>
@@ -2998,7 +3372,7 @@
           </w:tcPr>
           <w:p>
             <w:r>
-              <w:t>selected_cv_max_f1</w:t>
+              <w:t>cv_max_f2_threshold</w:t>
             </w:r>
           </w:p>
         </w:tc>
@@ -3008,7 +3382,7 @@
           </w:tcPr>
           <w:p>
             <w:r>
-              <w:t>0.384</w:t>
+              <w:t>0.176</w:t>
             </w:r>
           </w:p>
         </w:tc>
@@ -3018,7 +3392,7 @@
           </w:tcPr>
           <w:p>
             <w:r>
-              <w:t>0.762</w:t>
+              <w:t>0.591</w:t>
             </w:r>
           </w:p>
         </w:tc>
@@ -3028,7 +3402,7 @@
           </w:tcPr>
           <w:p>
             <w:r>
-              <w:t>0.833</w:t>
+              <w:t>0.977</w:t>
             </w:r>
           </w:p>
         </w:tc>
@@ -3038,7 +3412,7 @@
           </w:tcPr>
           <w:p>
             <w:r>
-              <w:t>717</w:t>
+              <w:t>99</w:t>
             </w:r>
           </w:p>
         </w:tc>
@@ -3048,7 +3422,7 @@
           </w:tcPr>
           <w:p>
             <w:r>
-              <w:t>1119</w:t>
+              <w:t>2906</w:t>
             </w:r>
           </w:p>
         </w:tc>
@@ -3060,7 +3434,7 @@
           </w:tcPr>
           <w:p>
             <w:r>
-              <w:t>capacity_10pct</w:t>
+              <w:t>cv_recall85_threshold</w:t>
             </w:r>
           </w:p>
         </w:tc>
@@ -3070,7 +3444,7 @@
           </w:tcPr>
           <w:p>
             <w:r>
-              <w:t>0.994</w:t>
+              <w:t>0.360</w:t>
             </w:r>
           </w:p>
         </w:tc>
@@ -3080,7 +3454,7 @@
           </w:tcPr>
           <w:p>
             <w:r>
-              <w:t>1.000</w:t>
+              <w:t>0.734</w:t>
             </w:r>
           </w:p>
         </w:tc>
@@ -3090,7 +3464,7 @@
           </w:tcPr>
           <w:p>
             <w:r>
-              <w:t>0.199</w:t>
+              <w:t>0.856</w:t>
             </w:r>
           </w:p>
         </w:tc>
@@ -3100,7 +3474,7 @@
           </w:tcPr>
           <w:p>
             <w:r>
-              <w:t>3446</w:t>
+              <w:t>618</w:t>
             </w:r>
           </w:p>
         </w:tc>
@@ -3110,7 +3484,7 @@
           </w:tcPr>
           <w:p>
             <w:r>
-              <w:t>0</w:t>
+              <w:t>1334</w:t>
             </w:r>
           </w:p>
         </w:tc>
@@ -3122,7 +3496,7 @@
           </w:tcPr>
           <w:p>
             <w:r>
-              <w:t>capacity_20pct</w:t>
+              <w:t>selected_cv_max_f1</w:t>
             </w:r>
           </w:p>
         </w:tc>
@@ -3132,7 +3506,7 @@
           </w:tcPr>
           <w:p>
             <w:r>
-              <w:t>0.915</w:t>
+              <w:t>0.370</w:t>
             </w:r>
           </w:p>
         </w:tc>
@@ -3142,7 +3516,7 @@
           </w:tcPr>
           <w:p>
             <w:r>
-              <w:t>0.994</w:t>
+              <w:t>0.742</w:t>
             </w:r>
           </w:p>
         </w:tc>
@@ -3152,7 +3526,7 @@
           </w:tcPr>
           <w:p>
             <w:r>
-              <w:t>0.377</w:t>
+              <w:t>0.849</w:t>
             </w:r>
           </w:p>
         </w:tc>
@@ -3162,7 +3536,7 @@
           </w:tcPr>
           <w:p>
             <w:r>
-              <w:t>2678</w:t>
+              <w:t>651</w:t>
             </w:r>
           </w:p>
         </w:tc>
@@ -3172,7 +3546,7 @@
           </w:tcPr>
           <w:p>
             <w:r>
-              <w:t>10</w:t>
+              <w:t>1269</w:t>
             </w:r>
           </w:p>
         </w:tc>
@@ -3184,7 +3558,7 @@
           </w:tcPr>
           <w:p>
             <w:r>
-              <w:t>capacity_30pct</w:t>
+              <w:t>capacity_10pct</w:t>
             </w:r>
           </w:p>
         </w:tc>
@@ -3194,7 +3568,7 @@
           </w:tcPr>
           <w:p>
             <w:r>
-              <w:t>0.719</w:t>
+              <w:t>0.993</w:t>
             </w:r>
           </w:p>
         </w:tc>
@@ -3204,7 +3578,7 @@
           </w:tcPr>
           <w:p>
             <w:r>
-              <w:t>0.942</w:t>
+              <w:t>1.000</w:t>
             </w:r>
           </w:p>
         </w:tc>
@@ -3214,7 +3588,7 @@
           </w:tcPr>
           <w:p>
             <w:r>
-              <w:t>0.555</w:t>
+              <w:t>0.211</w:t>
             </w:r>
           </w:p>
         </w:tc>
@@ -3224,7 +3598,7 @@
           </w:tcPr>
           <w:p>
             <w:r>
-              <w:t>1916</w:t>
+              <w:t>3396</w:t>
             </w:r>
           </w:p>
         </w:tc>
@@ -3234,7 +3608,7 @@
           </w:tcPr>
           <w:p>
             <w:r>
-              <w:t>146</w:t>
+              <w:t>0</w:t>
             </w:r>
           </w:p>
         </w:tc>
@@ -3246,7 +3620,7 @@
           </w:tcPr>
           <w:p>
             <w:r>
-              <w:t>fixed_0.25</w:t>
+              <w:t>capacity_20pct</w:t>
             </w:r>
           </w:p>
         </w:tc>
@@ -3256,7 +3630,7 @@
           </w:tcPr>
           <w:p>
             <w:r>
-              <w:t>0.250</w:t>
+              <w:t>0.928</w:t>
             </w:r>
           </w:p>
         </w:tc>
@@ -3266,7 +3640,7 @@
           </w:tcPr>
           <w:p>
             <w:r>
-              <w:t>0.653</w:t>
+              <w:t>0.991</w:t>
             </w:r>
           </w:p>
         </w:tc>
@@ -3276,7 +3650,7 @@
           </w:tcPr>
           <w:p>
             <w:r>
-              <w:t>0.935</w:t>
+              <w:t>0.377</w:t>
             </w:r>
           </w:p>
         </w:tc>
@@ -3286,7 +3660,7 @@
           </w:tcPr>
           <w:p>
             <w:r>
-              <w:t>281</w:t>
+              <w:t>2681</w:t>
             </w:r>
           </w:p>
         </w:tc>
@@ -3296,7 +3670,7 @@
           </w:tcPr>
           <w:p>
             <w:r>
-              <w:t>2136</w:t>
+              <w:t>14</w:t>
             </w:r>
           </w:p>
         </w:tc>
@@ -3308,7 +3682,7 @@
           </w:tcPr>
           <w:p>
             <w:r>
-              <w:t>fixed_0.35</w:t>
+              <w:t>capacity_30pct</w:t>
             </w:r>
           </w:p>
         </w:tc>
@@ -3318,7 +3692,7 @@
           </w:tcPr>
           <w:p>
             <w:r>
-              <w:t>0.350</w:t>
+              <w:t>0.737</w:t>
             </w:r>
           </w:p>
         </w:tc>
@@ -3328,7 +3702,7 @@
           </w:tcPr>
           <w:p>
             <w:r>
-              <w:t>0.734</w:t>
+              <w:t>0.942</w:t>
             </w:r>
           </w:p>
         </w:tc>
@@ -3338,7 +3712,7 @@
           </w:tcPr>
           <w:p>
             <w:r>
-              <w:t>0.861</w:t>
+              <w:t>0.549</w:t>
             </w:r>
           </w:p>
         </w:tc>
@@ -3348,7 +3722,7 @@
           </w:tcPr>
           <w:p>
             <w:r>
-              <w:t>597</w:t>
+              <w:t>1940</w:t>
             </w:r>
           </w:p>
         </w:tc>
@@ -3358,7 +3732,7 @@
           </w:tcPr>
           <w:p>
             <w:r>
-              <w:t>1344</w:t>
+              <w:t>145</w:t>
             </w:r>
           </w:p>
         </w:tc>
@@ -3370,7 +3744,7 @@
           </w:tcPr>
           <w:p>
             <w:r>
-              <w:t>fixed_0.50</w:t>
+              <w:t>capacity_60pct</w:t>
             </w:r>
           </w:p>
         </w:tc>
@@ -3380,7 +3754,7 @@
           </w:tcPr>
           <w:p>
             <w:r>
-              <w:t>0.500</w:t>
+              <w:t>0.372</w:t>
             </w:r>
           </w:p>
         </w:tc>
@@ -3390,7 +3764,7 @@
           </w:tcPr>
           <w:p>
             <w:r>
-              <w:t>0.840</w:t>
+              <w:t>0.744</w:t>
             </w:r>
           </w:p>
         </w:tc>
@@ -3400,7 +3774,7 @@
           </w:tcPr>
           <w:p>
             <w:r>
-              <w:t>0.736</w:t>
+              <w:t>0.848</w:t>
             </w:r>
           </w:p>
         </w:tc>
@@ -3410,7 +3784,7 @@
           </w:tcPr>
           <w:p>
             <w:r>
-              <w:t>1134</w:t>
+              <w:t>654</w:t>
             </w:r>
           </w:p>
         </w:tc>
@@ -3420,7 +3794,7 @@
           </w:tcPr>
           <w:p>
             <w:r>
-              <w:t>603</w:t>
+              <w:t>1256</w:t>
             </w:r>
           </w:p>
         </w:tc>
@@ -3432,7 +3806,7 @@
           </w:tcPr>
           <w:p>
             <w:r>
-              <w:t>fixed_0.65</w:t>
+              <w:t>fixed_0.25</w:t>
             </w:r>
           </w:p>
         </w:tc>
@@ -3442,7 +3816,7 @@
           </w:tcPr>
           <w:p>
             <w:r>
-              <w:t>0.650</w:t>
+              <w:t>0.250</w:t>
             </w:r>
           </w:p>
         </w:tc>
@@ -3452,7 +3826,7 @@
           </w:tcPr>
           <w:p>
             <w:r>
-              <w:t>0.920</w:t>
+              <w:t>0.647</w:t>
             </w:r>
           </w:p>
         </w:tc>
@@ -3462,7 +3836,7 @@
           </w:tcPr>
           <w:p>
             <w:r>
-              <w:t>0.614</w:t>
+              <w:t>0.939</w:t>
             </w:r>
           </w:p>
         </w:tc>
@@ -3472,7 +3846,7 @@
           </w:tcPr>
           <w:p>
             <w:r>
-              <w:t>1660</w:t>
+              <w:t>262</w:t>
             </w:r>
           </w:p>
         </w:tc>
@@ -3482,7 +3856,7 @@
           </w:tcPr>
           <w:p>
             <w:r>
-              <w:t>229</w:t>
+              <w:t>2203</w:t>
             </w:r>
           </w:p>
         </w:tc>
@@ -3494,6 +3868,192 @@
           </w:tcPr>
           <w:p>
             <w:r>
+              <w:t>fixed_0.35</w:t>
+            </w:r>
+          </w:p>
+        </w:tc>
+        <w:tc>
+          <w:tcPr>
+            <w:tcW w:type="dxa" w:w="1440"/>
+          </w:tcPr>
+          <w:p>
+            <w:r>
+              <w:t>0.350</w:t>
+            </w:r>
+          </w:p>
+        </w:tc>
+        <w:tc>
+          <w:tcPr>
+            <w:tcW w:type="dxa" w:w="1440"/>
+          </w:tcPr>
+          <w:p>
+            <w:r>
+              <w:t>0.728</w:t>
+            </w:r>
+          </w:p>
+        </w:tc>
+        <w:tc>
+          <w:tcPr>
+            <w:tcW w:type="dxa" w:w="1440"/>
+          </w:tcPr>
+          <w:p>
+            <w:r>
+              <w:t>0.863</w:t>
+            </w:r>
+          </w:p>
+        </w:tc>
+        <w:tc>
+          <w:tcPr>
+            <w:tcW w:type="dxa" w:w="1440"/>
+          </w:tcPr>
+          <w:p>
+            <w:r>
+              <w:t>590</w:t>
+            </w:r>
+          </w:p>
+        </w:tc>
+        <w:tc>
+          <w:tcPr>
+            <w:tcW w:type="dxa" w:w="1440"/>
+          </w:tcPr>
+          <w:p>
+            <w:r>
+              <w:t>1389</w:t>
+            </w:r>
+          </w:p>
+        </w:tc>
+      </w:tr>
+      <w:tr>
+        <w:tc>
+          <w:tcPr>
+            <w:tcW w:type="dxa" w:w="1440"/>
+          </w:tcPr>
+          <w:p>
+            <w:r>
+              <w:t>fixed_0.50</w:t>
+            </w:r>
+          </w:p>
+        </w:tc>
+        <w:tc>
+          <w:tcPr>
+            <w:tcW w:type="dxa" w:w="1440"/>
+          </w:tcPr>
+          <w:p>
+            <w:r>
+              <w:t>0.500</w:t>
+            </w:r>
+          </w:p>
+        </w:tc>
+        <w:tc>
+          <w:tcPr>
+            <w:tcW w:type="dxa" w:w="1440"/>
+          </w:tcPr>
+          <w:p>
+            <w:r>
+              <w:t>0.836</w:t>
+            </w:r>
+          </w:p>
+        </w:tc>
+        <w:tc>
+          <w:tcPr>
+            <w:tcW w:type="dxa" w:w="1440"/>
+          </w:tcPr>
+          <w:p>
+            <w:r>
+              <w:t>0.748</w:t>
+            </w:r>
+          </w:p>
+        </w:tc>
+        <w:tc>
+          <w:tcPr>
+            <w:tcW w:type="dxa" w:w="1440"/>
+          </w:tcPr>
+          <w:p>
+            <w:r>
+              <w:t>1086</w:t>
+            </w:r>
+          </w:p>
+        </w:tc>
+        <w:tc>
+          <w:tcPr>
+            <w:tcW w:type="dxa" w:w="1440"/>
+          </w:tcPr>
+          <w:p>
+            <w:r>
+              <w:t>632</w:t>
+            </w:r>
+          </w:p>
+        </w:tc>
+      </w:tr>
+      <w:tr>
+        <w:tc>
+          <w:tcPr>
+            <w:tcW w:type="dxa" w:w="1440"/>
+          </w:tcPr>
+          <w:p>
+            <w:r>
+              <w:t>fixed_0.65</w:t>
+            </w:r>
+          </w:p>
+        </w:tc>
+        <w:tc>
+          <w:tcPr>
+            <w:tcW w:type="dxa" w:w="1440"/>
+          </w:tcPr>
+          <w:p>
+            <w:r>
+              <w:t>0.650</w:t>
+            </w:r>
+          </w:p>
+        </w:tc>
+        <w:tc>
+          <w:tcPr>
+            <w:tcW w:type="dxa" w:w="1440"/>
+          </w:tcPr>
+          <w:p>
+            <w:r>
+              <w:t>0.913</w:t>
+            </w:r>
+          </w:p>
+        </w:tc>
+        <w:tc>
+          <w:tcPr>
+            <w:tcW w:type="dxa" w:w="1440"/>
+          </w:tcPr>
+          <w:p>
+            <w:r>
+              <w:t>0.623</w:t>
+            </w:r>
+          </w:p>
+        </w:tc>
+        <w:tc>
+          <w:tcPr>
+            <w:tcW w:type="dxa" w:w="1440"/>
+          </w:tcPr>
+          <w:p>
+            <w:r>
+              <w:t>1624</w:t>
+            </w:r>
+          </w:p>
+        </w:tc>
+        <w:tc>
+          <w:tcPr>
+            <w:tcW w:type="dxa" w:w="1440"/>
+          </w:tcPr>
+          <w:p>
+            <w:r>
+              <w:t>254</w:t>
+            </w:r>
+          </w:p>
+        </w:tc>
+      </w:tr>
+      <w:tr>
+        <w:tc>
+          <w:tcPr>
+            <w:tcW w:type="dxa" w:w="1440"/>
+          </w:tcPr>
+          <w:p>
+            <w:r>
               <w:t>fixed_0.75</w:t>
             </w:r>
           </w:p>
@@ -3514,7 +4074,7 @@
           </w:tcPr>
           <w:p>
             <w:r>
-              <w:t>0.951</w:t>
+              <w:t>0.949</w:t>
             </w:r>
           </w:p>
         </w:tc>
@@ -3524,7 +4084,7 @@
           </w:tcPr>
           <w:p>
             <w:r>
-              <w:t>0.526</w:t>
+              <w:t>0.537</w:t>
             </w:r>
           </w:p>
         </w:tc>
@@ -3534,7 +4094,7 @@
           </w:tcPr>
           <w:p>
             <w:r>
-              <w:t>2037</w:t>
+              <w:t>1991</w:t>
             </w:r>
           </w:p>
         </w:tc>
@@ -3544,7 +4104,7 @@
           </w:tcPr>
           <w:p>
             <w:r>
-              <w:t>117</w:t>
+              <w:t>124</w:t>
             </w:r>
           </w:p>
         </w:tc>
@@ -3553,15 +4113,286 @@
     <w:p/>
     <w:p>
       <w:r>
-        <w:t>Urgent tier (threshold 0.384): precision 0.762, recall 0.833, F1 0.796, alerts 4704 (57.7% of test cohort), ROC-AUC 0.872. Capacity tier: precision 99.4%, recall 37.7%. AUC is threshold-independent, so threshold tuning changes alert volume, precision, recall, and F1, but not the model's ranking quality.</w:t>
+        <w:t>High-touch queue (threshold 0.928): precision 0.991, recall 0.377, F1 0.546, students 1635 (20.1% of test cohort), ROC-AUC 0.870. This is intentionally framed as an advisor queue rather than an urgent alert sent for most students.</w:t>
       </w:r>
     </w:p>
+    <w:tbl>
+      <w:tblPr>
+        <w:tblStyle w:val="LightGrid-Accent1"/>
+        <w:tblW w:type="auto" w:w="0"/>
+        <w:tblLook w:firstColumn="1" w:firstRow="1" w:lastColumn="0" w:lastRow="0" w:noHBand="0" w:noVBand="1" w:val="04A0"/>
+      </w:tblPr>
+      <w:tblGrid>
+        <w:gridCol w:w="1728"/>
+        <w:gridCol w:w="1728"/>
+        <w:gridCol w:w="1728"/>
+        <w:gridCol w:w="1728"/>
+        <w:gridCol w:w="1728"/>
+      </w:tblGrid>
+      <w:tr>
+        <w:tc>
+          <w:tcPr>
+            <w:tcW w:type="dxa" w:w="1728"/>
+          </w:tcPr>
+          <w:p>
+            <w:r>
+              <w:t>Tier</w:t>
+            </w:r>
+          </w:p>
+        </w:tc>
+        <w:tc>
+          <w:tcPr>
+            <w:tcW w:type="dxa" w:w="1728"/>
+          </w:tcPr>
+          <w:p>
+            <w:r>
+              <w:t>Students</w:t>
+            </w:r>
+          </w:p>
+        </w:tc>
+        <w:tc>
+          <w:tcPr>
+            <w:tcW w:type="dxa" w:w="1728"/>
+          </w:tcPr>
+          <w:p>
+            <w:r>
+              <w:t>Share</w:t>
+            </w:r>
+          </w:p>
+        </w:tc>
+        <w:tc>
+          <w:tcPr>
+            <w:tcW w:type="dxa" w:w="1728"/>
+          </w:tcPr>
+          <w:p>
+            <w:r>
+              <w:t>Observed risk</w:t>
+            </w:r>
+          </w:p>
+        </w:tc>
+        <w:tc>
+          <w:tcPr>
+            <w:tcW w:type="dxa" w:w="1728"/>
+          </w:tcPr>
+          <w:p>
+            <w:r>
+              <w:t>Captured risk</w:t>
+            </w:r>
+          </w:p>
+        </w:tc>
+      </w:tr>
+      <w:tr>
+        <w:tc>
+          <w:tcPr>
+            <w:tcW w:type="dxa" w:w="1728"/>
+          </w:tcPr>
+          <w:p>
+            <w:r>
+              <w:t>High-touch support queue</w:t>
+            </w:r>
+          </w:p>
+        </w:tc>
+        <w:tc>
+          <w:tcPr>
+            <w:tcW w:type="dxa" w:w="1728"/>
+          </w:tcPr>
+          <w:p>
+            <w:r>
+              <w:t>1635</w:t>
+            </w:r>
+          </w:p>
+        </w:tc>
+        <w:tc>
+          <w:tcPr>
+            <w:tcW w:type="dxa" w:w="1728"/>
+          </w:tcPr>
+          <w:p>
+            <w:r>
+              <w:t>20.1%</w:t>
+            </w:r>
+          </w:p>
+        </w:tc>
+        <w:tc>
+          <w:tcPr>
+            <w:tcW w:type="dxa" w:w="1728"/>
+          </w:tcPr>
+          <w:p>
+            <w:r>
+              <w:t>99.1%</w:t>
+            </w:r>
+          </w:p>
+        </w:tc>
+        <w:tc>
+          <w:tcPr>
+            <w:tcW w:type="dxa" w:w="1728"/>
+          </w:tcPr>
+          <w:p>
+            <w:r>
+              <w:t>37.7%</w:t>
+            </w:r>
+          </w:p>
+        </w:tc>
+      </w:tr>
+      <w:tr>
+        <w:tc>
+          <w:tcPr>
+            <w:tcW w:type="dxa" w:w="1728"/>
+          </w:tcPr>
+          <w:p>
+            <w:r>
+              <w:t>Light-touch behavioural nudges</w:t>
+            </w:r>
+          </w:p>
+        </w:tc>
+        <w:tc>
+          <w:tcPr>
+            <w:tcW w:type="dxa" w:w="1728"/>
+          </w:tcPr>
+          <w:p>
+            <w:r>
+              <w:t>3269</w:t>
+            </w:r>
+          </w:p>
+        </w:tc>
+        <w:tc>
+          <w:tcPr>
+            <w:tcW w:type="dxa" w:w="1728"/>
+          </w:tcPr>
+          <w:p>
+            <w:r>
+              <w:t>40.1%</w:t>
+            </w:r>
+          </w:p>
+        </w:tc>
+        <w:tc>
+          <w:tcPr>
+            <w:tcW w:type="dxa" w:w="1728"/>
+          </w:tcPr>
+          <w:p>
+            <w:r>
+              <w:t>62.0%</w:t>
+            </w:r>
+          </w:p>
+        </w:tc>
+        <w:tc>
+          <w:tcPr>
+            <w:tcW w:type="dxa" w:w="1728"/>
+          </w:tcPr>
+          <w:p>
+            <w:r>
+              <w:t>47.1%</w:t>
+            </w:r>
+          </w:p>
+        </w:tc>
+      </w:tr>
+      <w:tr>
+        <w:tc>
+          <w:tcPr>
+            <w:tcW w:type="dxa" w:w="1728"/>
+          </w:tcPr>
+          <w:p>
+            <w:r>
+              <w:t>Monitoring / no immediate intervention</w:t>
+            </w:r>
+          </w:p>
+        </w:tc>
+        <w:tc>
+          <w:tcPr>
+            <w:tcW w:type="dxa" w:w="1728"/>
+          </w:tcPr>
+          <w:p>
+            <w:r>
+              <w:t>3245</w:t>
+            </w:r>
+          </w:p>
+        </w:tc>
+        <w:tc>
+          <w:tcPr>
+            <w:tcW w:type="dxa" w:w="1728"/>
+          </w:tcPr>
+          <w:p>
+            <w:r>
+              <w:t>39.8%</w:t>
+            </w:r>
+          </w:p>
+        </w:tc>
+        <w:tc>
+          <w:tcPr>
+            <w:tcW w:type="dxa" w:w="1728"/>
+          </w:tcPr>
+          <w:p>
+            <w:r>
+              <w:t>20.2%</w:t>
+            </w:r>
+          </w:p>
+        </w:tc>
+        <w:tc>
+          <w:tcPr>
+            <w:tcW w:type="dxa" w:w="1728"/>
+          </w:tcPr>
+          <w:p>
+            <w:r>
+              <w:t>15.2%</w:t>
+            </w:r>
+          </w:p>
+        </w:tc>
+      </w:tr>
+    </w:tbl>
+    <w:p/>
+    <w:p>
+      <w:r>
+        <w:drawing>
+          <wp:inline xmlns:a="http://schemas.openxmlformats.org/drawingml/2006/main" xmlns:pic="http://schemas.openxmlformats.org/drawingml/2006/picture">
+            <wp:extent cx="5029200" cy="2933700"/>
+            <wp:docPr id="8" name="Picture 8"/>
+            <wp:cNvGraphicFramePr>
+              <a:graphicFrameLocks noChangeAspect="1"/>
+            </wp:cNvGraphicFramePr>
+            <a:graphic>
+              <a:graphicData uri="http://schemas.openxmlformats.org/drawingml/2006/picture">
+                <pic:pic>
+                  <pic:nvPicPr>
+                    <pic:cNvPr id="0" name="intervention_tiers.png"/>
+                    <pic:cNvPicPr/>
+                  </pic:nvPicPr>
+                  <pic:blipFill>
+                    <a:blip r:embed="rId16"/>
+                    <a:stretch>
+                      <a:fillRect/>
+                    </a:stretch>
+                  </pic:blipFill>
+                  <pic:spPr>
+                    <a:xfrm>
+                      <a:off x="0" y="0"/>
+                      <a:ext cx="5029200" cy="2933700"/>
+                    </a:xfrm>
+                    <a:prstGeom prst="rect"/>
+                  </pic:spPr>
+                </pic:pic>
+              </a:graphicData>
+            </a:graphic>
+          </wp:inline>
+        </w:drawing>
+      </w:r>
+    </w:p>
+    <w:p>
+      <w:pPr>
+        <w:jc w:val="center"/>
+      </w:pPr>
+      <w:r>
+        <w:rPr>
+          <w:i/>
+        </w:rPr>
+        <w:t>Figure 7. Capacity-based intervention tiers.</w:t>
+      </w:r>
+    </w:p>
+    <w:p/>
     <w:p>
       <w:r>
         <w:drawing>
           <wp:inline xmlns:a="http://schemas.openxmlformats.org/drawingml/2006/main" xmlns:pic="http://schemas.openxmlformats.org/drawingml/2006/picture">
             <wp:extent cx="5029200" cy="3771900"/>
-            <wp:docPr id="7" name="Picture 7"/>
+            <wp:docPr id="9" name="Picture 9"/>
             <wp:cNvGraphicFramePr>
               <a:graphicFrameLocks noChangeAspect="1"/>
             </wp:cNvGraphicFramePr>
@@ -3573,7 +4404,7 @@
                     <pic:cNvPicPr/>
                   </pic:nvPicPr>
                   <pic:blipFill>
-                    <a:blip r:embed="rId15"/>
+                    <a:blip r:embed="rId17"/>
                     <a:stretch>
                       <a:fillRect/>
                     </a:stretch>
@@ -3600,7 +4431,7 @@
         <w:rPr>
           <w:i/>
         </w:rPr>
-        <w:t>Figure 6. Urgent-tier confusion matrix.</w:t>
+        <w:t>Figure 8. High-touch queue confusion matrix.</w:t>
       </w:r>
     </w:p>
     <w:p/>
@@ -3609,7 +4440,7 @@
         <w:drawing>
           <wp:inline xmlns:a="http://schemas.openxmlformats.org/drawingml/2006/main" xmlns:pic="http://schemas.openxmlformats.org/drawingml/2006/picture">
             <wp:extent cx="5029200" cy="3249637"/>
-            <wp:docPr id="8" name="Picture 8"/>
+            <wp:docPr id="10" name="Picture 10"/>
             <wp:cNvGraphicFramePr>
               <a:graphicFrameLocks noChangeAspect="1"/>
             </wp:cNvGraphicFramePr>
@@ -3621,7 +4452,7 @@
                     <pic:cNvPicPr/>
                   </pic:nvPicPr>
                   <pic:blipFill>
-                    <a:blip r:embed="rId16"/>
+                    <a:blip r:embed="rId18"/>
                     <a:stretch>
                       <a:fillRect/>
                     </a:stretch>
@@ -3648,7 +4479,7 @@
         <w:rPr>
           <w:i/>
         </w:rPr>
-        <w:t>Figure 7. Threshold tradeoff.</w:t>
+        <w:t>Figure 9. Risk cutoff tradeoff.</w:t>
       </w:r>
     </w:p>
     <w:p/>
@@ -3657,7 +4488,7 @@
         <w:drawing>
           <wp:inline xmlns:a="http://schemas.openxmlformats.org/drawingml/2006/main" xmlns:pic="http://schemas.openxmlformats.org/drawingml/2006/picture">
             <wp:extent cx="5029200" cy="3840480"/>
-            <wp:docPr id="9" name="Picture 9"/>
+            <wp:docPr id="11" name="Picture 11"/>
             <wp:cNvGraphicFramePr>
               <a:graphicFrameLocks noChangeAspect="1"/>
             </wp:cNvGraphicFramePr>
@@ -3669,7 +4500,7 @@
                     <pic:cNvPicPr/>
                   </pic:nvPicPr>
                   <pic:blipFill>
-                    <a:blip r:embed="rId17"/>
+                    <a:blip r:embed="rId19"/>
                     <a:stretch>
                       <a:fillRect/>
                     </a:stretch>
@@ -3696,7 +4527,7 @@
         <w:rPr>
           <w:i/>
         </w:rPr>
-        <w:t>Figure 8. Calibration curve.</w:t>
+        <w:t>Figure 10. Calibration curve.</w:t>
       </w:r>
     </w:p>
     <w:p/>
@@ -3824,7 +4655,7 @@
           </w:tcPr>
           <w:p>
             <w:r>
-              <w:t>module_code</w:t>
+              <w:t>engagement_score_6</w:t>
             </w:r>
           </w:p>
         </w:tc>
@@ -3834,7 +4665,7 @@
           </w:tcPr>
           <w:p>
             <w:r>
-              <w:t>High-ranking model driver.</w:t>
+              <w:t>Combines recency, consistency, diversity, and assessment behavior into a trajectory signal.</w:t>
             </w:r>
           </w:p>
         </w:tc>
@@ -3888,7 +4719,7 @@
           </w:tcPr>
           <w:p>
             <w:r>
-              <w:t>assessment_submitted_ratio_6</w:t>
+              <w:t>weekly_clicks_norm_6</w:t>
             </w:r>
           </w:p>
         </w:tc>
@@ -3898,7 +4729,7 @@
           </w:tcPr>
           <w:p>
             <w:r>
-              <w:t>Missing early assessments is both predictive and directly actionable for advisors.</w:t>
+              <w:t>Advisor-actionable engagement or assessment behavior.</w:t>
             </w:r>
           </w:p>
         </w:tc>
@@ -3920,7 +4751,7 @@
           </w:tcPr>
           <w:p>
             <w:r>
-              <w:t>weekly_clicks_norm_6</w:t>
+              <w:t>assessment_submitted_ratio_6</w:t>
             </w:r>
           </w:p>
         </w:tc>
@@ -3930,7 +4761,7 @@
           </w:tcPr>
           <w:p>
             <w:r>
-              <w:t>Advisor-actionable engagement or assessment behavior.</w:t>
+              <w:t>Missing early assessments is both predictive and directly actionable for advisors.</w:t>
             </w:r>
           </w:p>
         </w:tc>
@@ -3939,7 +4770,7 @@
     <w:p/>
     <w:p>
       <w:r>
-        <w:t>Top driver: assessment completion (withdraw/fail mean 55.9% vs 96.4% for successful students). Advisor alert at balanced urgent threshold 0.38 or high-recall watchlist 0.19 includes risk tier, calibrated probability, engagement trajectory, assessment context, and top drivers.</w:t>
+        <w:t>Top driver: assessment completion (withdraw/fail mean 55.9% vs 96.4% for successful students). The advisor-facing output includes tier, calibrated probability, engagement trajectory, assessment context, and top drivers.</w:t>
       </w:r>
     </w:p>
     <w:tbl>
@@ -4035,7 +4866,7 @@
           </w:tcPr>
           <w:p>
             <w:r>
-              <w:t>Urgent</w:t>
+              <w:t>High-touch support queue</w:t>
             </w:r>
           </w:p>
         </w:tc>
@@ -4101,7 +4932,7 @@
           </w:tcPr>
           <w:p>
             <w:r>
-              <w:t>Send check-in within 48 hours. Ask about workload, access issues, and confidence with course material. Offer academic support session.</w:t>
+              <w:t>Prioritize for advisor outreach. Ask about workload, access issues, and confidence with course material. Offer academic support session.</w:t>
             </w:r>
           </w:p>
         </w:tc>
@@ -4170,7 +5001,7 @@
           </w:tcPr>
           <w:p>
             <w:r>
-              <w:t>2479</w:t>
+              <w:t>1647</w:t>
             </w:r>
           </w:p>
         </w:tc>
@@ -4192,7 +5023,7 @@
           </w:tcPr>
           <w:p>
             <w:r>
-              <w:t>11.1%</w:t>
+              <w:t>35.4%</w:t>
             </w:r>
           </w:p>
         </w:tc>
@@ -4214,7 +5045,7 @@
           </w:tcPr>
           <w:p>
             <w:r>
-              <w:t>59.4%</w:t>
+              <w:t>46.8%</w:t>
             </w:r>
           </w:p>
         </w:tc>
@@ -4236,7 +5067,7 @@
           </w:tcPr>
           <w:p>
             <w:r>
-              <w:t>AAA, EEE, GGG</w:t>
+              <w:t>AAA, GGG, EEE</w:t>
             </w:r>
           </w:p>
         </w:tc>

</xml_diff>

<commit_message>
Update report headline metrics and regenerate deliverables
</commit_message>
<xml_diff>
--- a/reports/Studor_PathAI_Report.docx
+++ b/reports/Studor_PathAI_Report.docx
@@ -34,8 +34,47 @@
       </w:r>
     </w:p>
     <w:p>
+      <w:pPr>
+        <w:pStyle w:val="Heading2"/>
+      </w:pPr>
       <w:r>
-        <w:t>The dataset contains 32,593 enrolments across 7 modules. Overall risk rate is 52.8%. The Week 6 model now feeds three intervention tiers instead of a broad urgent alert: top 20.1% high-touch support queue, next 40.1% light-touch nudges, and monitoring for the rest (ROC-AUC 0.870). The engagement score band gradient runs from 98.4% withdraw/fail (0–20 band) to 19.0% (80–100 band). Collaborative filtering hit@3 is 46.8% versus 35.4% for content-based recommendations.</w:t>
+        <w:t>Task 1: Behavioral Engagement Scoring</w:t>
+      </w:r>
+    </w:p>
+    <w:p>
+      <w:r>
+        <w:t>The score is built from six interpretable feature buckets: activity volume, consistency and rhythm, recency gaps, resource diversity and intent, course-pace alignment, and assessment behavior. These signals support seven archetypes: steady engager, early dropout, late recoverer, burst engager, perfectionist procrastinator, compliance engager, and opportunistic engager. The strongest validation result is the Week 6 score gradient: 98.4% withdraw/fail in the 0-20 score band versus 19.0% in the 80-100 band.</w:t>
+      </w:r>
+    </w:p>
+    <w:p>
+      <w:pPr>
+        <w:pStyle w:val="Heading2"/>
+      </w:pPr>
+      <w:r>
+        <w:t>Task 2: Week 6 Disengagement Model</w:t>
+      </w:r>
+    </w:p>
+    <w:p>
+      <w:r>
+        <w:t>The final model is XGBoost, trained only on features available by Week 6. Its output is framed as three intervention tiers rather than a single urgent alert, reducing alert fatigue while preserving actionability. The headline metrics are ROC-AUC 0.870, high-touch precision 0.991, top-60% light-touch F1 0.793, and top-60% light-touch recall 0.848.</w:t>
+      </w:r>
+    </w:p>
+    <w:p>
+      <w:pPr>
+        <w:pStyle w:val="Heading2"/>
+      </w:pPr>
+      <w:r>
+        <w:t>Task 3: Next-Module Recommendation</w:t>
+      </w:r>
+    </w:p>
+    <w:p>
+      <w:r>
+        <w:t>The recommender compares collaborative filtering against a shared student-course feature-space content model. The content model uses cosine similarity plus a Wilson lower-bound pass-rate prior, which keeps cold-start recommendations conservative instead of chasing noisy pass rates. Content hit@3 is 0.354, collaborative hit@3 is 0.468, and the cold-start modules are AAA, GGG, EEE.</w:t>
+      </w:r>
+    </w:p>
+    <w:p>
+      <w:r>
+        <w:t>The dataset contains 32,593 enrolments across 7 modules. Overall risk rate is 52.8%. The core product choice is to translate statistical outputs into advisor-friendly workflows rather than exposing raw model scores alone.</w:t>
       </w:r>
     </w:p>
     <w:p>
@@ -4113,7 +4152,7 @@
     <w:p/>
     <w:p>
       <w:r>
-        <w:t>High-touch queue (threshold 0.928): precision 0.991, recall 0.377, F1 0.546, students 1635 (20.1% of test cohort), ROC-AUC 0.870. This is intentionally framed as an advisor queue rather than an urgent alert sent for most students.</w:t>
+        <w:t>High-touch queue (threshold 0.928): precision 0.991, recall 0.377, students 1635 (20.1% of test cohort). The broader top-60% light-touch tier has F1 0.793 and recall 0.848; overall model ranking quality is ROC-AUC 0.870. This is intentionally framed as tiered support rather than a single urgent alert sent for most students.</w:t>
       </w:r>
     </w:p>
     <w:tbl>

</xml_diff>

<commit_message>
Updated the report text to emphasize that model selection and alert-thre
</commit_message>
<xml_diff>
--- a/reports/Studor_PathAI_Report.docx
+++ b/reports/Studor_PathAI_Report.docx
@@ -56,7 +56,7 @@
     </w:p>
     <w:p>
       <w:r>
-        <w:t>The final model is XGBoost, trained only on features available by Week 6. Its output is framed as three intervention tiers rather than a single urgent alert, reducing alert fatigue while preserving actionability. The headline metrics are ROC-AUC 0.870, high-touch precision 0.991, top-60% light-touch F1 0.793, and top-60% light-touch recall 0.848.</w:t>
+        <w:t>The final model is XGBoost, trained only on features available by Week 6. Its output is framed as three intervention tiers rather than a single urgent alert, reducing alert fatigue while preserving actionability. The headline metrics are ROC-AUC 0.870, high-touch precision 0.991, top-60% light-touch F1 0.793, and top-60% light-touch recall 0.848. Model selection and alerting are separated deliberately: XGBoost ranks risk, while intervention thresholds reflect advisor capacity and alert-fatigue risk.</w:t>
       </w:r>
     </w:p>
     <w:p>
@@ -1500,6 +1500,11 @@
     <w:p>
       <w:r>
         <w:t>Population check: 23,809 of 32,593 enrolments (73.0%) show pre-start activity. Risk rate with pre-start: 44.7%; without: 74.9%.</w:t>
+      </w:r>
+    </w:p>
+    <w:p>
+      <w:r>
+        <w:t>By contrast, date_unregistration is treated as an audit field rather than a predictive feature. It can reveal future withdrawal timing, so including it in the Week 6 model would overstate real-world performance.</w:t>
       </w:r>
     </w:p>
     <w:p>
@@ -2760,7 +2765,7 @@
     </w:p>
     <w:p>
       <w:r>
-        <w:t>The notebook model-selection table compared Logistic Regression, Random Forest, XGBoost, and a regularized XGBoost variant. XGBoost is now the production model because it delivered the best validation F1 and recall while keeping ROC-AUC and PR-AUC competitive. To reduce runtime, default pipeline runs now train XGBoost only and retain the comparison table as model-selection evidence.</w:t>
+        <w:t>The notebook model-selection table compared Logistic Regression, Random Forest, XGBoost, and a regularized XGBoost variant. XGBoost is now the production model because it delivered the best validation F1 and recall while keeping ROC-AUC and PR-AUC competitive. Thresholding is a separate product decision: after selecting the model, operating cutoffs are chosen from the precision-recall tradeoff based on advisor workload. To reduce runtime, default pipeline runs now train XGBoost only and retain the comparison table as model-selection evidence.</w:t>
       </w:r>
     </w:p>
     <w:tbl>
@@ -4152,7 +4157,7 @@
     <w:p/>
     <w:p>
       <w:r>
-        <w:t>High-touch queue (threshold 0.928): precision 0.991, recall 0.377, students 1635 (20.1% of test cohort). The broader top-60% light-touch tier has F1 0.793 and recall 0.848; overall model ranking quality is ROC-AUC 0.870. This is intentionally framed as tiered support rather than a single urgent alert sent for most students.</w:t>
+        <w:t>High-touch queue (threshold 0.928): precision 0.991, recall 0.377, students 1635 (20.1% of test cohort). The broader top-60% light-touch tier has F1 0.793 and recall 0.848; overall model ranking quality is ROC-AUC 0.870. The model ranks risk; the product decides whether that risk becomes high-touch support, light-touch nudges, or monitoring.</w:t>
       </w:r>
     </w:p>
     <w:tbl>

</xml_diff>

<commit_message>
Add advisor-facing risk alert details to report
</commit_message>
<xml_diff>
--- a/reports/Studor_PathAI_Report.docx
+++ b/reports/Studor_PathAI_Report.docx
@@ -4160,6 +4160,29 @@
         <w:t>High-touch queue (threshold 0.928): precision 0.991, recall 0.377, students 1635 (20.1% of test cohort). The broader top-60% light-touch tier has F1 0.793 and recall 0.848; overall model ranking quality is ROC-AUC 0.870. The model ranks risk; the product decides whether that risk becomes high-touch support, light-touch nudges, or monitoring.</w:t>
       </w:r>
     </w:p>
+    <w:p>
+      <w:pPr>
+        <w:pStyle w:val="Heading2"/>
+      </w:pPr>
+      <w:r>
+        <w:t>4.1 What An Advisor Receives</w:t>
+      </w:r>
+    </w:p>
+    <w:p>
+      <w:r>
+        <w:t>At the end of Week 6, each course presentation generates a ranked list of students needing support. For each student, the advisor sees the student ID, course, predicted risk score, intervention tier, three plain-English reason codes, and a recommended action.</w:t>
+      </w:r>
+    </w:p>
+    <w:p>
+      <w:r>
+        <w:t>Reason codes are translated from the strongest per-student risk signals, for example: missed or late assessments, silent weeks in the six-week window, a long gap since last VLE activity, low activity diversity, or low assessment completion. The advisor sees why this student is flagged, not just a probability.</w:t>
+      </w:r>
+    </w:p>
+    <w:p>
+      <w:r>
+        <w:t>Delivery is tiered: high-touch students appear in a live advisor queue and trigger a push notification; light-touch students are included in a weekly digest and automated nudge workflow; monitoring students remain visible on the dashboard without immediate action.</w:t>
+      </w:r>
+    </w:p>
     <w:tbl>
       <w:tblPr>
         <w:tblStyle w:val="LightGrid-Accent1"/>
@@ -4435,7 +4458,7 @@
       <w:r>
         <w:drawing>
           <wp:inline xmlns:a="http://schemas.openxmlformats.org/drawingml/2006/main" xmlns:pic="http://schemas.openxmlformats.org/drawingml/2006/picture">
-            <wp:extent cx="5029200" cy="3771900"/>
+            <wp:extent cx="5029200" cy="4023360"/>
             <wp:docPr id="9" name="Picture 9"/>
             <wp:cNvGraphicFramePr>
               <a:graphicFrameLocks noChangeAspect="1"/>
@@ -4456,7 +4479,7 @@
                   <pic:spPr>
                     <a:xfrm>
                       <a:off x="0" y="0"/>
-                      <a:ext cx="5029200" cy="3771900"/>
+                      <a:ext cx="5029200" cy="4023360"/>
                     </a:xfrm>
                     <a:prstGeom prst="rect"/>
                   </pic:spPr>
@@ -4475,7 +4498,7 @@
         <w:rPr>
           <w:i/>
         </w:rPr>
-        <w:t>Figure 8. High-touch queue confusion matrix.</w:t>
+        <w:t>Figure 8. Top-60% light-touch confusion matrix.</w:t>
       </w:r>
     </w:p>
     <w:p/>

</xml_diff>